<commit_message>
fix: unmerged CAREER HISTORY table in Strata template to fix work history generation
</commit_message>
<xml_diff>
--- a/Backend/templates/Strata - CVF Template.docx
+++ b/Backend/templates/Strata - CVF Template.docx
@@ -1,6 +1,6 @@
 
 <file path=word/document.xml><?xml version="1.0" encoding="utf-8"?>
-<w:document xmlns:wpc="http://schemas.microsoft.com/office/word/2010/wordprocessingCanvas" xmlns:cx="http://schemas.microsoft.com/office/drawing/2014/chartex" xmlns:cx1="http://schemas.microsoft.com/office/drawing/2015/9/8/chartex" xmlns:cx2="http://schemas.microsoft.com/office/drawing/2015/10/21/chartex" xmlns:cx3="http://schemas.microsoft.com/office/drawing/2016/5/9/chartex" xmlns:cx4="http://schemas.microsoft.com/office/drawing/2016/5/10/chartex" xmlns:cx5="http://schemas.microsoft.com/office/drawing/2016/5/11/chartex" xmlns:cx6="http://schemas.microsoft.com/office/drawing/2016/5/12/chartex" xmlns:cx7="http://schemas.microsoft.com/office/drawing/2016/5/13/chartex" xmlns:cx8="http://schemas.microsoft.com/office/drawing/2016/5/14/chartex" xmlns:mc="http://schemas.openxmlformats.org/markup-compatibility/2006" xmlns:aink="http://schemas.microsoft.com/office/drawing/2016/ink" xmlns:am3d="http://schemas.microsoft.com/office/drawing/2017/model3d" xmlns:o="urn:schemas-microsoft-com:office:office" xmlns:oel="http://schemas.microsoft.com/office/2019/extlst" xmlns:r="http://schemas.openxmlformats.org/officeDocument/2006/relationships" xmlns:m="http://schemas.openxmlformats.org/officeDocument/2006/math" xmlns:v="urn:schemas-microsoft-com:vml" xmlns:wp14="http://schemas.microsoft.com/office/word/2010/wordprocessingDrawing" xmlns:wp="http://schemas.openxmlformats.org/drawingml/2006/wordprocessingDrawing" xmlns:w10="urn:schemas-microsoft-com:office:word" xmlns:w="http://schemas.openxmlformats.org/wordprocessingml/2006/main" xmlns:w14="http://schemas.microsoft.com/office/word/2010/wordml" xmlns:w15="http://schemas.microsoft.com/office/word/2012/wordml" xmlns:w16cex="http://schemas.microsoft.com/office/word/2018/wordml/cex" xmlns:w16cid="http://schemas.microsoft.com/office/word/2016/wordml/cid" xmlns:w16="http://schemas.microsoft.com/office/word/2018/wordml" xmlns:w16du="http://schemas.microsoft.com/office/word/2023/wordml/word16du" xmlns:w16sdtdh="http://schemas.microsoft.com/office/word/2020/wordml/sdtdatahash" xmlns:w16sdtfl="http://schemas.microsoft.com/office/word/2024/wordml/sdtformatlock" xmlns:w16se="http://schemas.microsoft.com/office/word/2015/wordml/symex" xmlns:wpg="http://schemas.microsoft.com/office/word/2010/wordprocessingGroup" xmlns:wpi="http://schemas.microsoft.com/office/word/2010/wordprocessingInk" xmlns:wne="http://schemas.microsoft.com/office/word/2006/wordml" xmlns:wps="http://schemas.microsoft.com/office/word/2010/wordprocessingShape" mc:Ignorable="w14 w15 w16se w16cid w16 w16cex w16sdtdh w16sdtfl w16du wp14">
+<w:document xmlns:wpc="http://schemas.microsoft.com/office/word/2010/wordprocessingCanvas" xmlns:cx="http://schemas.microsoft.com/office/drawing/2014/chartex" xmlns:cx1="http://schemas.microsoft.com/office/drawing/2015/9/8/chartex" xmlns:cx2="http://schemas.microsoft.com/office/drawing/2015/10/21/chartex" xmlns:cx3="http://schemas.microsoft.com/office/drawing/2016/5/9/chartex" xmlns:cx4="http://schemas.microsoft.com/office/drawing/2016/5/10/chartex" xmlns:cx5="http://schemas.microsoft.com/office/drawing/2016/5/11/chartex" xmlns:cx6="http://schemas.microsoft.com/office/drawing/2016/5/12/chartex" xmlns:cx7="http://schemas.microsoft.com/office/drawing/2016/5/13/chartex" xmlns:cx8="http://schemas.microsoft.com/office/drawing/2016/5/14/chartex" xmlns:mc="http://schemas.openxmlformats.org/markup-compatibility/2006" xmlns:aink="http://schemas.microsoft.com/office/drawing/2016/ink" xmlns:am3d="http://schemas.microsoft.com/office/drawing/2017/model3d" xmlns:o="urn:schemas-microsoft-com:office:office" xmlns:oel="http://schemas.microsoft.com/office/2019/extlst" xmlns:r="http://schemas.openxmlformats.org/officeDocument/2006/relationships" xmlns:m="http://schemas.openxmlformats.org/officeDocument/2006/math" xmlns:v="urn:schemas-microsoft-com:vml" xmlns:wp14="http://schemas.microsoft.com/office/word/2010/wordprocessingDrawing" xmlns:wp="http://schemas.openxmlformats.org/drawingml/2006/wordprocessingDrawing" xmlns:w10="urn:schemas-microsoft-com:office:word" xmlns:w="http://schemas.openxmlformats.org/wordprocessingml/2006/main" xmlns:w14="http://schemas.microsoft.com/office/word/2010/wordml" xmlns:w15="http://schemas.microsoft.com/office/word/2012/wordml" xmlns:w16cei="http://schemas.microsoft.com/office/word/2026/wordml/cei" xmlns:w16cex="http://schemas.microsoft.com/office/word/2018/wordml/cex" xmlns:w16cid="http://schemas.microsoft.com/office/word/2016/wordml/cid" xmlns:w16="http://schemas.microsoft.com/office/word/2018/wordml" xmlns:w16du="http://schemas.microsoft.com/office/word/2023/wordml/word16du" xmlns:w16sdtdh="http://schemas.microsoft.com/office/word/2020/wordml/sdtdatahash" xmlns:w16sdtfl="http://schemas.microsoft.com/office/word/2024/wordml/sdtformatlock" xmlns:w16se="http://schemas.microsoft.com/office/word/2015/wordml/symex" xmlns:wpg="http://schemas.microsoft.com/office/word/2010/wordprocessingGroup" xmlns:wpi="http://schemas.microsoft.com/office/word/2010/wordprocessingInk" xmlns:wne="http://schemas.microsoft.com/office/word/2006/wordml" xmlns:wps="http://schemas.microsoft.com/office/word/2010/wordprocessingShape" mc:Ignorable="w14 w15 w16se w16cid w16 w16cex w16sdtdh w16sdtfl w16du wp14">
   <w:body>
     <w:tbl>
       <w:tblPr>
@@ -840,17 +840,24 @@
           </w:p>
         </w:tc>
       </w:tr>
+    </w:tbl>
+    <w:p/>
+    <w:tbl>
+      <w:tblPr>
+        <w:tblW w:w="5000" w:type="pct"/>
+        <w:jc w:val="center"/>
+        <w:tblLook w:val="04A0" w:firstRow="1" w:lastRow="0" w:firstColumn="1" w:lastColumn="0" w:noHBand="0" w:noVBand="1"/>
+      </w:tblPr>
+      <w:tblGrid>
+        <w:gridCol w:w="9780"/>
+      </w:tblGrid>
       <w:tr>
-        <w:tblPrEx>
-          <w:jc w:val="center"/>
-        </w:tblPrEx>
         <w:trPr>
           <w:jc w:val="center"/>
         </w:trPr>
         <w:tc>
           <w:tcPr>
             <w:tcW w:w="5000" w:type="pct"/>
-            <w:gridSpan w:val="7"/>
             <w:shd w:val="clear" w:color="auto" w:fill="000000"/>
             <w:vAlign w:val="center"/>
           </w:tcPr>
@@ -935,7 +942,7 @@
 </file>
 
 <file path=word/endnotes.xml><?xml version="1.0" encoding="utf-8"?>
-<w:endnotes xmlns:wpc="http://schemas.microsoft.com/office/word/2010/wordprocessingCanvas" xmlns:cx="http://schemas.microsoft.com/office/drawing/2014/chartex" xmlns:cx1="http://schemas.microsoft.com/office/drawing/2015/9/8/chartex" xmlns:cx2="http://schemas.microsoft.com/office/drawing/2015/10/21/chartex" xmlns:cx3="http://schemas.microsoft.com/office/drawing/2016/5/9/chartex" xmlns:cx4="http://schemas.microsoft.com/office/drawing/2016/5/10/chartex" xmlns:cx5="http://schemas.microsoft.com/office/drawing/2016/5/11/chartex" xmlns:cx6="http://schemas.microsoft.com/office/drawing/2016/5/12/chartex" xmlns:cx7="http://schemas.microsoft.com/office/drawing/2016/5/13/chartex" xmlns:cx8="http://schemas.microsoft.com/office/drawing/2016/5/14/chartex" xmlns:mc="http://schemas.openxmlformats.org/markup-compatibility/2006" xmlns:aink="http://schemas.microsoft.com/office/drawing/2016/ink" xmlns:am3d="http://schemas.microsoft.com/office/drawing/2017/model3d" xmlns:o="urn:schemas-microsoft-com:office:office" xmlns:oel="http://schemas.microsoft.com/office/2019/extlst" xmlns:r="http://schemas.openxmlformats.org/officeDocument/2006/relationships" xmlns:m="http://schemas.openxmlformats.org/officeDocument/2006/math" xmlns:v="urn:schemas-microsoft-com:vml" xmlns:wp14="http://schemas.microsoft.com/office/word/2010/wordprocessingDrawing" xmlns:wp="http://schemas.openxmlformats.org/drawingml/2006/wordprocessingDrawing" xmlns:w10="urn:schemas-microsoft-com:office:word" xmlns:w="http://schemas.openxmlformats.org/wordprocessingml/2006/main" xmlns:w14="http://schemas.microsoft.com/office/word/2010/wordml" xmlns:w15="http://schemas.microsoft.com/office/word/2012/wordml" xmlns:w16cex="http://schemas.microsoft.com/office/word/2018/wordml/cex" xmlns:w16cid="http://schemas.microsoft.com/office/word/2016/wordml/cid" xmlns:w16="http://schemas.microsoft.com/office/word/2018/wordml" xmlns:w16du="http://schemas.microsoft.com/office/word/2023/wordml/word16du" xmlns:w16sdtdh="http://schemas.microsoft.com/office/word/2020/wordml/sdtdatahash" xmlns:w16sdtfl="http://schemas.microsoft.com/office/word/2024/wordml/sdtformatlock" xmlns:w16se="http://schemas.microsoft.com/office/word/2015/wordml/symex" xmlns:wpg="http://schemas.microsoft.com/office/word/2010/wordprocessingGroup" xmlns:wpi="http://schemas.microsoft.com/office/word/2010/wordprocessingInk" xmlns:wne="http://schemas.microsoft.com/office/word/2006/wordml" xmlns:wps="http://schemas.microsoft.com/office/word/2010/wordprocessingShape" mc:Ignorable="w14 w15 w16se w16cid w16 w16cex w16sdtdh w16sdtfl w16du wp14">
+<w:endnotes xmlns:wpc="http://schemas.microsoft.com/office/word/2010/wordprocessingCanvas" xmlns:cx="http://schemas.microsoft.com/office/drawing/2014/chartex" xmlns:cx1="http://schemas.microsoft.com/office/drawing/2015/9/8/chartex" xmlns:cx2="http://schemas.microsoft.com/office/drawing/2015/10/21/chartex" xmlns:cx3="http://schemas.microsoft.com/office/drawing/2016/5/9/chartex" xmlns:cx4="http://schemas.microsoft.com/office/drawing/2016/5/10/chartex" xmlns:cx5="http://schemas.microsoft.com/office/drawing/2016/5/11/chartex" xmlns:cx6="http://schemas.microsoft.com/office/drawing/2016/5/12/chartex" xmlns:cx7="http://schemas.microsoft.com/office/drawing/2016/5/13/chartex" xmlns:cx8="http://schemas.microsoft.com/office/drawing/2016/5/14/chartex" xmlns:mc="http://schemas.openxmlformats.org/markup-compatibility/2006" xmlns:aink="http://schemas.microsoft.com/office/drawing/2016/ink" xmlns:am3d="http://schemas.microsoft.com/office/drawing/2017/model3d" xmlns:o="urn:schemas-microsoft-com:office:office" xmlns:oel="http://schemas.microsoft.com/office/2019/extlst" xmlns:r="http://schemas.openxmlformats.org/officeDocument/2006/relationships" xmlns:m="http://schemas.openxmlformats.org/officeDocument/2006/math" xmlns:v="urn:schemas-microsoft-com:vml" xmlns:wp14="http://schemas.microsoft.com/office/word/2010/wordprocessingDrawing" xmlns:wp="http://schemas.openxmlformats.org/drawingml/2006/wordprocessingDrawing" xmlns:w10="urn:schemas-microsoft-com:office:word" xmlns:w="http://schemas.openxmlformats.org/wordprocessingml/2006/main" xmlns:w14="http://schemas.microsoft.com/office/word/2010/wordml" xmlns:w15="http://schemas.microsoft.com/office/word/2012/wordml" xmlns:w16cei="http://schemas.microsoft.com/office/word/2026/wordml/cei" xmlns:w16cex="http://schemas.microsoft.com/office/word/2018/wordml/cex" xmlns:w16cid="http://schemas.microsoft.com/office/word/2016/wordml/cid" xmlns:w16="http://schemas.microsoft.com/office/word/2018/wordml" xmlns:w16du="http://schemas.microsoft.com/office/word/2023/wordml/word16du" xmlns:w16sdtdh="http://schemas.microsoft.com/office/word/2020/wordml/sdtdatahash" xmlns:w16sdtfl="http://schemas.microsoft.com/office/word/2024/wordml/sdtformatlock" xmlns:w16se="http://schemas.microsoft.com/office/word/2015/wordml/symex" xmlns:wpg="http://schemas.microsoft.com/office/word/2010/wordprocessingGroup" xmlns:wpi="http://schemas.microsoft.com/office/word/2010/wordprocessingInk" xmlns:wne="http://schemas.microsoft.com/office/word/2006/wordml" xmlns:wps="http://schemas.microsoft.com/office/word/2010/wordprocessingShape" mc:Ignorable="w14 w15 w16se w16cid w16 w16cex w16sdtdh w16sdtfl w16du wp14">
   <w:endnote w:type="separator" w:id="-1">
     <w:p>
       <w:r>
@@ -954,7 +961,7 @@
 </file>
 
 <file path=word/footer1.xml><?xml version="1.0" encoding="utf-8"?>
-<w:ftr xmlns:wpc="http://schemas.microsoft.com/office/word/2010/wordprocessingCanvas" xmlns:cx="http://schemas.microsoft.com/office/drawing/2014/chartex" xmlns:cx1="http://schemas.microsoft.com/office/drawing/2015/9/8/chartex" xmlns:cx2="http://schemas.microsoft.com/office/drawing/2015/10/21/chartex" xmlns:cx3="http://schemas.microsoft.com/office/drawing/2016/5/9/chartex" xmlns:cx4="http://schemas.microsoft.com/office/drawing/2016/5/10/chartex" xmlns:cx5="http://schemas.microsoft.com/office/drawing/2016/5/11/chartex" xmlns:cx6="http://schemas.microsoft.com/office/drawing/2016/5/12/chartex" xmlns:cx7="http://schemas.microsoft.com/office/drawing/2016/5/13/chartex" xmlns:cx8="http://schemas.microsoft.com/office/drawing/2016/5/14/chartex" xmlns:mc="http://schemas.openxmlformats.org/markup-compatibility/2006" xmlns:aink="http://schemas.microsoft.com/office/drawing/2016/ink" xmlns:am3d="http://schemas.microsoft.com/office/drawing/2017/model3d" xmlns:o="urn:schemas-microsoft-com:office:office" xmlns:oel="http://schemas.microsoft.com/office/2019/extlst" xmlns:r="http://schemas.openxmlformats.org/officeDocument/2006/relationships" xmlns:m="http://schemas.openxmlformats.org/officeDocument/2006/math" xmlns:v="urn:schemas-microsoft-com:vml" xmlns:wp14="http://schemas.microsoft.com/office/word/2010/wordprocessingDrawing" xmlns:wp="http://schemas.openxmlformats.org/drawingml/2006/wordprocessingDrawing" xmlns:w10="urn:schemas-microsoft-com:office:word" xmlns:w="http://schemas.openxmlformats.org/wordprocessingml/2006/main" xmlns:w14="http://schemas.microsoft.com/office/word/2010/wordml" xmlns:w15="http://schemas.microsoft.com/office/word/2012/wordml" xmlns:w16cex="http://schemas.microsoft.com/office/word/2018/wordml/cex" xmlns:w16cid="http://schemas.microsoft.com/office/word/2016/wordml/cid" xmlns:w16="http://schemas.microsoft.com/office/word/2018/wordml" xmlns:w16du="http://schemas.microsoft.com/office/word/2023/wordml/word16du" xmlns:w16sdtdh="http://schemas.microsoft.com/office/word/2020/wordml/sdtdatahash" xmlns:w16sdtfl="http://schemas.microsoft.com/office/word/2024/wordml/sdtformatlock" xmlns:w16se="http://schemas.microsoft.com/office/word/2015/wordml/symex" xmlns:wpg="http://schemas.microsoft.com/office/word/2010/wordprocessingGroup" xmlns:wpi="http://schemas.microsoft.com/office/word/2010/wordprocessingInk" xmlns:wne="http://schemas.microsoft.com/office/word/2006/wordml" xmlns:wps="http://schemas.microsoft.com/office/word/2010/wordprocessingShape" mc:Ignorable="w14 w15 w16se w16cid w16 w16cex w16sdtdh w16sdtfl w16du wp14">
+<w:ftr xmlns:wpc="http://schemas.microsoft.com/office/word/2010/wordprocessingCanvas" xmlns:cx="http://schemas.microsoft.com/office/drawing/2014/chartex" xmlns:cx1="http://schemas.microsoft.com/office/drawing/2015/9/8/chartex" xmlns:cx2="http://schemas.microsoft.com/office/drawing/2015/10/21/chartex" xmlns:cx3="http://schemas.microsoft.com/office/drawing/2016/5/9/chartex" xmlns:cx4="http://schemas.microsoft.com/office/drawing/2016/5/10/chartex" xmlns:cx5="http://schemas.microsoft.com/office/drawing/2016/5/11/chartex" xmlns:cx6="http://schemas.microsoft.com/office/drawing/2016/5/12/chartex" xmlns:cx7="http://schemas.microsoft.com/office/drawing/2016/5/13/chartex" xmlns:cx8="http://schemas.microsoft.com/office/drawing/2016/5/14/chartex" xmlns:mc="http://schemas.openxmlformats.org/markup-compatibility/2006" xmlns:aink="http://schemas.microsoft.com/office/drawing/2016/ink" xmlns:am3d="http://schemas.microsoft.com/office/drawing/2017/model3d" xmlns:o="urn:schemas-microsoft-com:office:office" xmlns:oel="http://schemas.microsoft.com/office/2019/extlst" xmlns:r="http://schemas.openxmlformats.org/officeDocument/2006/relationships" xmlns:m="http://schemas.openxmlformats.org/officeDocument/2006/math" xmlns:v="urn:schemas-microsoft-com:vml" xmlns:wp14="http://schemas.microsoft.com/office/word/2010/wordprocessingDrawing" xmlns:wp="http://schemas.openxmlformats.org/drawingml/2006/wordprocessingDrawing" xmlns:w10="urn:schemas-microsoft-com:office:word" xmlns:w="http://schemas.openxmlformats.org/wordprocessingml/2006/main" xmlns:w14="http://schemas.microsoft.com/office/word/2010/wordml" xmlns:w15="http://schemas.microsoft.com/office/word/2012/wordml" xmlns:w16cei="http://schemas.microsoft.com/office/word/2026/wordml/cei" xmlns:w16cex="http://schemas.microsoft.com/office/word/2018/wordml/cex" xmlns:w16cid="http://schemas.microsoft.com/office/word/2016/wordml/cid" xmlns:w16="http://schemas.microsoft.com/office/word/2018/wordml" xmlns:w16du="http://schemas.microsoft.com/office/word/2023/wordml/word16du" xmlns:w16sdtdh="http://schemas.microsoft.com/office/word/2020/wordml/sdtdatahash" xmlns:w16sdtfl="http://schemas.microsoft.com/office/word/2024/wordml/sdtformatlock" xmlns:w16se="http://schemas.microsoft.com/office/word/2015/wordml/symex" xmlns:wpg="http://schemas.microsoft.com/office/word/2010/wordprocessingGroup" xmlns:wpi="http://schemas.microsoft.com/office/word/2010/wordprocessingInk" xmlns:wne="http://schemas.microsoft.com/office/word/2006/wordml" xmlns:wps="http://schemas.microsoft.com/office/word/2010/wordprocessingShape" mc:Ignorable="w14 w15 w16se w16cid w16 w16cex w16sdtdh w16sdtfl w16du wp14">
   <w:p>
     <w:pPr>
       <w:pStyle w:val="Footer"/>
@@ -964,7 +971,7 @@
 </file>
 
 <file path=word/footer2.xml><?xml version="1.0" encoding="utf-8"?>
-<w:ftr xmlns:wpc="http://schemas.microsoft.com/office/word/2010/wordprocessingCanvas" xmlns:cx="http://schemas.microsoft.com/office/drawing/2014/chartex" xmlns:cx1="http://schemas.microsoft.com/office/drawing/2015/9/8/chartex" xmlns:cx2="http://schemas.microsoft.com/office/drawing/2015/10/21/chartex" xmlns:cx3="http://schemas.microsoft.com/office/drawing/2016/5/9/chartex" xmlns:cx4="http://schemas.microsoft.com/office/drawing/2016/5/10/chartex" xmlns:cx5="http://schemas.microsoft.com/office/drawing/2016/5/11/chartex" xmlns:cx6="http://schemas.microsoft.com/office/drawing/2016/5/12/chartex" xmlns:cx7="http://schemas.microsoft.com/office/drawing/2016/5/13/chartex" xmlns:cx8="http://schemas.microsoft.com/office/drawing/2016/5/14/chartex" xmlns:mc="http://schemas.openxmlformats.org/markup-compatibility/2006" xmlns:aink="http://schemas.microsoft.com/office/drawing/2016/ink" xmlns:am3d="http://schemas.microsoft.com/office/drawing/2017/model3d" xmlns:o="urn:schemas-microsoft-com:office:office" xmlns:oel="http://schemas.microsoft.com/office/2019/extlst" xmlns:r="http://schemas.openxmlformats.org/officeDocument/2006/relationships" xmlns:m="http://schemas.openxmlformats.org/officeDocument/2006/math" xmlns:v="urn:schemas-microsoft-com:vml" xmlns:wp14="http://schemas.microsoft.com/office/word/2010/wordprocessingDrawing" xmlns:wp="http://schemas.openxmlformats.org/drawingml/2006/wordprocessingDrawing" xmlns:w10="urn:schemas-microsoft-com:office:word" xmlns:w="http://schemas.openxmlformats.org/wordprocessingml/2006/main" xmlns:w14="http://schemas.microsoft.com/office/word/2010/wordml" xmlns:w15="http://schemas.microsoft.com/office/word/2012/wordml" xmlns:w16cex="http://schemas.microsoft.com/office/word/2018/wordml/cex" xmlns:w16cid="http://schemas.microsoft.com/office/word/2016/wordml/cid" xmlns:w16="http://schemas.microsoft.com/office/word/2018/wordml" xmlns:w16du="http://schemas.microsoft.com/office/word/2023/wordml/word16du" xmlns:w16sdtdh="http://schemas.microsoft.com/office/word/2020/wordml/sdtdatahash" xmlns:w16sdtfl="http://schemas.microsoft.com/office/word/2024/wordml/sdtformatlock" xmlns:w16se="http://schemas.microsoft.com/office/word/2015/wordml/symex" xmlns:wpg="http://schemas.microsoft.com/office/word/2010/wordprocessingGroup" xmlns:wpi="http://schemas.microsoft.com/office/word/2010/wordprocessingInk" xmlns:wne="http://schemas.microsoft.com/office/word/2006/wordml" xmlns:wps="http://schemas.microsoft.com/office/word/2010/wordprocessingShape" mc:Ignorable="w14 w15 w16se w16cid w16 w16cex w16sdtdh w16sdtfl w16du wp14">
+<w:ftr xmlns:wpc="http://schemas.microsoft.com/office/word/2010/wordprocessingCanvas" xmlns:cx="http://schemas.microsoft.com/office/drawing/2014/chartex" xmlns:cx1="http://schemas.microsoft.com/office/drawing/2015/9/8/chartex" xmlns:cx2="http://schemas.microsoft.com/office/drawing/2015/10/21/chartex" xmlns:cx3="http://schemas.microsoft.com/office/drawing/2016/5/9/chartex" xmlns:cx4="http://schemas.microsoft.com/office/drawing/2016/5/10/chartex" xmlns:cx5="http://schemas.microsoft.com/office/drawing/2016/5/11/chartex" xmlns:cx6="http://schemas.microsoft.com/office/drawing/2016/5/12/chartex" xmlns:cx7="http://schemas.microsoft.com/office/drawing/2016/5/13/chartex" xmlns:cx8="http://schemas.microsoft.com/office/drawing/2016/5/14/chartex" xmlns:mc="http://schemas.openxmlformats.org/markup-compatibility/2006" xmlns:aink="http://schemas.microsoft.com/office/drawing/2016/ink" xmlns:am3d="http://schemas.microsoft.com/office/drawing/2017/model3d" xmlns:o="urn:schemas-microsoft-com:office:office" xmlns:oel="http://schemas.microsoft.com/office/2019/extlst" xmlns:r="http://schemas.openxmlformats.org/officeDocument/2006/relationships" xmlns:m="http://schemas.openxmlformats.org/officeDocument/2006/math" xmlns:v="urn:schemas-microsoft-com:vml" xmlns:wp14="http://schemas.microsoft.com/office/word/2010/wordprocessingDrawing" xmlns:wp="http://schemas.openxmlformats.org/drawingml/2006/wordprocessingDrawing" xmlns:w10="urn:schemas-microsoft-com:office:word" xmlns:w="http://schemas.openxmlformats.org/wordprocessingml/2006/main" xmlns:w14="http://schemas.microsoft.com/office/word/2010/wordml" xmlns:w15="http://schemas.microsoft.com/office/word/2012/wordml" xmlns:w16cei="http://schemas.microsoft.com/office/word/2026/wordml/cei" xmlns:w16cex="http://schemas.microsoft.com/office/word/2018/wordml/cex" xmlns:w16cid="http://schemas.microsoft.com/office/word/2016/wordml/cid" xmlns:w16="http://schemas.microsoft.com/office/word/2018/wordml" xmlns:w16du="http://schemas.microsoft.com/office/word/2023/wordml/word16du" xmlns:w16sdtdh="http://schemas.microsoft.com/office/word/2020/wordml/sdtdatahash" xmlns:w16sdtfl="http://schemas.microsoft.com/office/word/2024/wordml/sdtformatlock" xmlns:w16se="http://schemas.microsoft.com/office/word/2015/wordml/symex" xmlns:wpg="http://schemas.microsoft.com/office/word/2010/wordprocessingGroup" xmlns:wpi="http://schemas.microsoft.com/office/word/2010/wordprocessingInk" xmlns:wne="http://schemas.microsoft.com/office/word/2006/wordml" xmlns:wps="http://schemas.microsoft.com/office/word/2010/wordprocessingShape" mc:Ignorable="w14 w15 w16se w16cid w16 w16cex w16sdtdh w16sdtfl w16du wp14">
   <w:p>
     <w:pPr>
       <w:pStyle w:val="Header"/>
@@ -1258,7 +1265,7 @@
 </file>
 
 <file path=word/footer3.xml><?xml version="1.0" encoding="utf-8"?>
-<w:ftr xmlns:wpc="http://schemas.microsoft.com/office/word/2010/wordprocessingCanvas" xmlns:cx="http://schemas.microsoft.com/office/drawing/2014/chartex" xmlns:cx1="http://schemas.microsoft.com/office/drawing/2015/9/8/chartex" xmlns:cx2="http://schemas.microsoft.com/office/drawing/2015/10/21/chartex" xmlns:cx3="http://schemas.microsoft.com/office/drawing/2016/5/9/chartex" xmlns:cx4="http://schemas.microsoft.com/office/drawing/2016/5/10/chartex" xmlns:cx5="http://schemas.microsoft.com/office/drawing/2016/5/11/chartex" xmlns:cx6="http://schemas.microsoft.com/office/drawing/2016/5/12/chartex" xmlns:cx7="http://schemas.microsoft.com/office/drawing/2016/5/13/chartex" xmlns:cx8="http://schemas.microsoft.com/office/drawing/2016/5/14/chartex" xmlns:mc="http://schemas.openxmlformats.org/markup-compatibility/2006" xmlns:aink="http://schemas.microsoft.com/office/drawing/2016/ink" xmlns:am3d="http://schemas.microsoft.com/office/drawing/2017/model3d" xmlns:o="urn:schemas-microsoft-com:office:office" xmlns:oel="http://schemas.microsoft.com/office/2019/extlst" xmlns:r="http://schemas.openxmlformats.org/officeDocument/2006/relationships" xmlns:m="http://schemas.openxmlformats.org/officeDocument/2006/math" xmlns:v="urn:schemas-microsoft-com:vml" xmlns:wp14="http://schemas.microsoft.com/office/word/2010/wordprocessingDrawing" xmlns:wp="http://schemas.openxmlformats.org/drawingml/2006/wordprocessingDrawing" xmlns:w10="urn:schemas-microsoft-com:office:word" xmlns:w="http://schemas.openxmlformats.org/wordprocessingml/2006/main" xmlns:w14="http://schemas.microsoft.com/office/word/2010/wordml" xmlns:w15="http://schemas.microsoft.com/office/word/2012/wordml" xmlns:w16cex="http://schemas.microsoft.com/office/word/2018/wordml/cex" xmlns:w16cid="http://schemas.microsoft.com/office/word/2016/wordml/cid" xmlns:w16="http://schemas.microsoft.com/office/word/2018/wordml" xmlns:w16du="http://schemas.microsoft.com/office/word/2023/wordml/word16du" xmlns:w16sdtdh="http://schemas.microsoft.com/office/word/2020/wordml/sdtdatahash" xmlns:w16sdtfl="http://schemas.microsoft.com/office/word/2024/wordml/sdtformatlock" xmlns:w16se="http://schemas.microsoft.com/office/word/2015/wordml/symex" xmlns:wpg="http://schemas.microsoft.com/office/word/2010/wordprocessingGroup" xmlns:wpi="http://schemas.microsoft.com/office/word/2010/wordprocessingInk" xmlns:wne="http://schemas.microsoft.com/office/word/2006/wordml" xmlns:wps="http://schemas.microsoft.com/office/word/2010/wordprocessingShape" mc:Ignorable="w14 w15 w16se w16cid w16 w16cex w16sdtdh w16sdtfl w16du wp14">
+<w:ftr xmlns:wpc="http://schemas.microsoft.com/office/word/2010/wordprocessingCanvas" xmlns:cx="http://schemas.microsoft.com/office/drawing/2014/chartex" xmlns:cx1="http://schemas.microsoft.com/office/drawing/2015/9/8/chartex" xmlns:cx2="http://schemas.microsoft.com/office/drawing/2015/10/21/chartex" xmlns:cx3="http://schemas.microsoft.com/office/drawing/2016/5/9/chartex" xmlns:cx4="http://schemas.microsoft.com/office/drawing/2016/5/10/chartex" xmlns:cx5="http://schemas.microsoft.com/office/drawing/2016/5/11/chartex" xmlns:cx6="http://schemas.microsoft.com/office/drawing/2016/5/12/chartex" xmlns:cx7="http://schemas.microsoft.com/office/drawing/2016/5/13/chartex" xmlns:cx8="http://schemas.microsoft.com/office/drawing/2016/5/14/chartex" xmlns:mc="http://schemas.openxmlformats.org/markup-compatibility/2006" xmlns:aink="http://schemas.microsoft.com/office/drawing/2016/ink" xmlns:am3d="http://schemas.microsoft.com/office/drawing/2017/model3d" xmlns:o="urn:schemas-microsoft-com:office:office" xmlns:oel="http://schemas.microsoft.com/office/2019/extlst" xmlns:r="http://schemas.openxmlformats.org/officeDocument/2006/relationships" xmlns:m="http://schemas.openxmlformats.org/officeDocument/2006/math" xmlns:v="urn:schemas-microsoft-com:vml" xmlns:wp14="http://schemas.microsoft.com/office/word/2010/wordprocessingDrawing" xmlns:wp="http://schemas.openxmlformats.org/drawingml/2006/wordprocessingDrawing" xmlns:w10="urn:schemas-microsoft-com:office:word" xmlns:w="http://schemas.openxmlformats.org/wordprocessingml/2006/main" xmlns:w14="http://schemas.microsoft.com/office/word/2010/wordml" xmlns:w15="http://schemas.microsoft.com/office/word/2012/wordml" xmlns:w16cei="http://schemas.microsoft.com/office/word/2026/wordml/cei" xmlns:w16cex="http://schemas.microsoft.com/office/word/2018/wordml/cex" xmlns:w16cid="http://schemas.microsoft.com/office/word/2016/wordml/cid" xmlns:w16="http://schemas.microsoft.com/office/word/2018/wordml" xmlns:w16du="http://schemas.microsoft.com/office/word/2023/wordml/word16du" xmlns:w16sdtdh="http://schemas.microsoft.com/office/word/2020/wordml/sdtdatahash" xmlns:w16sdtfl="http://schemas.microsoft.com/office/word/2024/wordml/sdtformatlock" xmlns:w16se="http://schemas.microsoft.com/office/word/2015/wordml/symex" xmlns:wpg="http://schemas.microsoft.com/office/word/2010/wordprocessingGroup" xmlns:wpi="http://schemas.microsoft.com/office/word/2010/wordprocessingInk" xmlns:wne="http://schemas.microsoft.com/office/word/2006/wordml" xmlns:wps="http://schemas.microsoft.com/office/word/2010/wordprocessingShape" mc:Ignorable="w14 w15 w16se w16cid w16 w16cex w16sdtdh w16sdtfl w16du wp14">
   <w:p>
     <w:pPr>
       <w:pStyle w:val="Footer"/>
@@ -1268,7 +1275,7 @@
 </file>
 
 <file path=word/footnotes.xml><?xml version="1.0" encoding="utf-8"?>
-<w:footnotes xmlns:wpc="http://schemas.microsoft.com/office/word/2010/wordprocessingCanvas" xmlns:cx="http://schemas.microsoft.com/office/drawing/2014/chartex" xmlns:cx1="http://schemas.microsoft.com/office/drawing/2015/9/8/chartex" xmlns:cx2="http://schemas.microsoft.com/office/drawing/2015/10/21/chartex" xmlns:cx3="http://schemas.microsoft.com/office/drawing/2016/5/9/chartex" xmlns:cx4="http://schemas.microsoft.com/office/drawing/2016/5/10/chartex" xmlns:cx5="http://schemas.microsoft.com/office/drawing/2016/5/11/chartex" xmlns:cx6="http://schemas.microsoft.com/office/drawing/2016/5/12/chartex" xmlns:cx7="http://schemas.microsoft.com/office/drawing/2016/5/13/chartex" xmlns:cx8="http://schemas.microsoft.com/office/drawing/2016/5/14/chartex" xmlns:mc="http://schemas.openxmlformats.org/markup-compatibility/2006" xmlns:aink="http://schemas.microsoft.com/office/drawing/2016/ink" xmlns:am3d="http://schemas.microsoft.com/office/drawing/2017/model3d" xmlns:o="urn:schemas-microsoft-com:office:office" xmlns:oel="http://schemas.microsoft.com/office/2019/extlst" xmlns:r="http://schemas.openxmlformats.org/officeDocument/2006/relationships" xmlns:m="http://schemas.openxmlformats.org/officeDocument/2006/math" xmlns:v="urn:schemas-microsoft-com:vml" xmlns:wp14="http://schemas.microsoft.com/office/word/2010/wordprocessingDrawing" xmlns:wp="http://schemas.openxmlformats.org/drawingml/2006/wordprocessingDrawing" xmlns:w10="urn:schemas-microsoft-com:office:word" xmlns:w="http://schemas.openxmlformats.org/wordprocessingml/2006/main" xmlns:w14="http://schemas.microsoft.com/office/word/2010/wordml" xmlns:w15="http://schemas.microsoft.com/office/word/2012/wordml" xmlns:w16cex="http://schemas.microsoft.com/office/word/2018/wordml/cex" xmlns:w16cid="http://schemas.microsoft.com/office/word/2016/wordml/cid" xmlns:w16="http://schemas.microsoft.com/office/word/2018/wordml" xmlns:w16du="http://schemas.microsoft.com/office/word/2023/wordml/word16du" xmlns:w16sdtdh="http://schemas.microsoft.com/office/word/2020/wordml/sdtdatahash" xmlns:w16sdtfl="http://schemas.microsoft.com/office/word/2024/wordml/sdtformatlock" xmlns:w16se="http://schemas.microsoft.com/office/word/2015/wordml/symex" xmlns:wpg="http://schemas.microsoft.com/office/word/2010/wordprocessingGroup" xmlns:wpi="http://schemas.microsoft.com/office/word/2010/wordprocessingInk" xmlns:wne="http://schemas.microsoft.com/office/word/2006/wordml" xmlns:wps="http://schemas.microsoft.com/office/word/2010/wordprocessingShape" mc:Ignorable="w14 w15 w16se w16cid w16 w16cex w16sdtdh w16sdtfl w16du wp14">
+<w:footnotes xmlns:wpc="http://schemas.microsoft.com/office/word/2010/wordprocessingCanvas" xmlns:cx="http://schemas.microsoft.com/office/drawing/2014/chartex" xmlns:cx1="http://schemas.microsoft.com/office/drawing/2015/9/8/chartex" xmlns:cx2="http://schemas.microsoft.com/office/drawing/2015/10/21/chartex" xmlns:cx3="http://schemas.microsoft.com/office/drawing/2016/5/9/chartex" xmlns:cx4="http://schemas.microsoft.com/office/drawing/2016/5/10/chartex" xmlns:cx5="http://schemas.microsoft.com/office/drawing/2016/5/11/chartex" xmlns:cx6="http://schemas.microsoft.com/office/drawing/2016/5/12/chartex" xmlns:cx7="http://schemas.microsoft.com/office/drawing/2016/5/13/chartex" xmlns:cx8="http://schemas.microsoft.com/office/drawing/2016/5/14/chartex" xmlns:mc="http://schemas.openxmlformats.org/markup-compatibility/2006" xmlns:aink="http://schemas.microsoft.com/office/drawing/2016/ink" xmlns:am3d="http://schemas.microsoft.com/office/drawing/2017/model3d" xmlns:o="urn:schemas-microsoft-com:office:office" xmlns:oel="http://schemas.microsoft.com/office/2019/extlst" xmlns:r="http://schemas.openxmlformats.org/officeDocument/2006/relationships" xmlns:m="http://schemas.openxmlformats.org/officeDocument/2006/math" xmlns:v="urn:schemas-microsoft-com:vml" xmlns:wp14="http://schemas.microsoft.com/office/word/2010/wordprocessingDrawing" xmlns:wp="http://schemas.openxmlformats.org/drawingml/2006/wordprocessingDrawing" xmlns:w10="urn:schemas-microsoft-com:office:word" xmlns:w="http://schemas.openxmlformats.org/wordprocessingml/2006/main" xmlns:w14="http://schemas.microsoft.com/office/word/2010/wordml" xmlns:w15="http://schemas.microsoft.com/office/word/2012/wordml" xmlns:w16cei="http://schemas.microsoft.com/office/word/2026/wordml/cei" xmlns:w16cex="http://schemas.microsoft.com/office/word/2018/wordml/cex" xmlns:w16cid="http://schemas.microsoft.com/office/word/2016/wordml/cid" xmlns:w16="http://schemas.microsoft.com/office/word/2018/wordml" xmlns:w16du="http://schemas.microsoft.com/office/word/2023/wordml/word16du" xmlns:w16sdtdh="http://schemas.microsoft.com/office/word/2020/wordml/sdtdatahash" xmlns:w16sdtfl="http://schemas.microsoft.com/office/word/2024/wordml/sdtformatlock" xmlns:w16se="http://schemas.microsoft.com/office/word/2015/wordml/symex" xmlns:wpg="http://schemas.microsoft.com/office/word/2010/wordprocessingGroup" xmlns:wpi="http://schemas.microsoft.com/office/word/2010/wordprocessingInk" xmlns:wne="http://schemas.microsoft.com/office/word/2006/wordml" xmlns:wps="http://schemas.microsoft.com/office/word/2010/wordprocessingShape" mc:Ignorable="w14 w15 w16se w16cid w16 w16cex w16sdtdh w16sdtfl w16du wp14">
   <w:footnote w:type="separator" w:id="-1">
     <w:p>
       <w:r>
@@ -1287,7 +1294,7 @@
 </file>
 
 <file path=word/header1.xml><?xml version="1.0" encoding="utf-8"?>
-<w:hdr xmlns:wpc="http://schemas.microsoft.com/office/word/2010/wordprocessingCanvas" xmlns:cx="http://schemas.microsoft.com/office/drawing/2014/chartex" xmlns:cx1="http://schemas.microsoft.com/office/drawing/2015/9/8/chartex" xmlns:cx2="http://schemas.microsoft.com/office/drawing/2015/10/21/chartex" xmlns:cx3="http://schemas.microsoft.com/office/drawing/2016/5/9/chartex" xmlns:cx4="http://schemas.microsoft.com/office/drawing/2016/5/10/chartex" xmlns:cx5="http://schemas.microsoft.com/office/drawing/2016/5/11/chartex" xmlns:cx6="http://schemas.microsoft.com/office/drawing/2016/5/12/chartex" xmlns:cx7="http://schemas.microsoft.com/office/drawing/2016/5/13/chartex" xmlns:cx8="http://schemas.microsoft.com/office/drawing/2016/5/14/chartex" xmlns:mc="http://schemas.openxmlformats.org/markup-compatibility/2006" xmlns:aink="http://schemas.microsoft.com/office/drawing/2016/ink" xmlns:am3d="http://schemas.microsoft.com/office/drawing/2017/model3d" xmlns:o="urn:schemas-microsoft-com:office:office" xmlns:oel="http://schemas.microsoft.com/office/2019/extlst" xmlns:r="http://schemas.openxmlformats.org/officeDocument/2006/relationships" xmlns:m="http://schemas.openxmlformats.org/officeDocument/2006/math" xmlns:v="urn:schemas-microsoft-com:vml" xmlns:wp14="http://schemas.microsoft.com/office/word/2010/wordprocessingDrawing" xmlns:wp="http://schemas.openxmlformats.org/drawingml/2006/wordprocessingDrawing" xmlns:w10="urn:schemas-microsoft-com:office:word" xmlns:w="http://schemas.openxmlformats.org/wordprocessingml/2006/main" xmlns:w14="http://schemas.microsoft.com/office/word/2010/wordml" xmlns:w15="http://schemas.microsoft.com/office/word/2012/wordml" xmlns:w16cex="http://schemas.microsoft.com/office/word/2018/wordml/cex" xmlns:w16cid="http://schemas.microsoft.com/office/word/2016/wordml/cid" xmlns:w16="http://schemas.microsoft.com/office/word/2018/wordml" xmlns:w16du="http://schemas.microsoft.com/office/word/2023/wordml/word16du" xmlns:w16sdtdh="http://schemas.microsoft.com/office/word/2020/wordml/sdtdatahash" xmlns:w16sdtfl="http://schemas.microsoft.com/office/word/2024/wordml/sdtformatlock" xmlns:w16se="http://schemas.microsoft.com/office/word/2015/wordml/symex" xmlns:wpg="http://schemas.microsoft.com/office/word/2010/wordprocessingGroup" xmlns:wpi="http://schemas.microsoft.com/office/word/2010/wordprocessingInk" xmlns:wne="http://schemas.microsoft.com/office/word/2006/wordml" xmlns:wps="http://schemas.microsoft.com/office/word/2010/wordprocessingShape" mc:Ignorable="w14 w15 w16se w16cid w16 w16cex w16sdtdh w16sdtfl w16du wp14">
+<w:hdr xmlns:wpc="http://schemas.microsoft.com/office/word/2010/wordprocessingCanvas" xmlns:cx="http://schemas.microsoft.com/office/drawing/2014/chartex" xmlns:cx1="http://schemas.microsoft.com/office/drawing/2015/9/8/chartex" xmlns:cx2="http://schemas.microsoft.com/office/drawing/2015/10/21/chartex" xmlns:cx3="http://schemas.microsoft.com/office/drawing/2016/5/9/chartex" xmlns:cx4="http://schemas.microsoft.com/office/drawing/2016/5/10/chartex" xmlns:cx5="http://schemas.microsoft.com/office/drawing/2016/5/11/chartex" xmlns:cx6="http://schemas.microsoft.com/office/drawing/2016/5/12/chartex" xmlns:cx7="http://schemas.microsoft.com/office/drawing/2016/5/13/chartex" xmlns:cx8="http://schemas.microsoft.com/office/drawing/2016/5/14/chartex" xmlns:mc="http://schemas.openxmlformats.org/markup-compatibility/2006" xmlns:aink="http://schemas.microsoft.com/office/drawing/2016/ink" xmlns:am3d="http://schemas.microsoft.com/office/drawing/2017/model3d" xmlns:o="urn:schemas-microsoft-com:office:office" xmlns:oel="http://schemas.microsoft.com/office/2019/extlst" xmlns:r="http://schemas.openxmlformats.org/officeDocument/2006/relationships" xmlns:m="http://schemas.openxmlformats.org/officeDocument/2006/math" xmlns:v="urn:schemas-microsoft-com:vml" xmlns:wp14="http://schemas.microsoft.com/office/word/2010/wordprocessingDrawing" xmlns:wp="http://schemas.openxmlformats.org/drawingml/2006/wordprocessingDrawing" xmlns:w10="urn:schemas-microsoft-com:office:word" xmlns:w="http://schemas.openxmlformats.org/wordprocessingml/2006/main" xmlns:w14="http://schemas.microsoft.com/office/word/2010/wordml" xmlns:w15="http://schemas.microsoft.com/office/word/2012/wordml" xmlns:w16cei="http://schemas.microsoft.com/office/word/2026/wordml/cei" xmlns:w16cex="http://schemas.microsoft.com/office/word/2018/wordml/cex" xmlns:w16cid="http://schemas.microsoft.com/office/word/2016/wordml/cid" xmlns:w16="http://schemas.microsoft.com/office/word/2018/wordml" xmlns:w16du="http://schemas.microsoft.com/office/word/2023/wordml/word16du" xmlns:w16sdtdh="http://schemas.microsoft.com/office/word/2020/wordml/sdtdatahash" xmlns:w16sdtfl="http://schemas.microsoft.com/office/word/2024/wordml/sdtformatlock" xmlns:w16se="http://schemas.microsoft.com/office/word/2015/wordml/symex" xmlns:wpg="http://schemas.microsoft.com/office/word/2010/wordprocessingGroup" xmlns:wpi="http://schemas.microsoft.com/office/word/2010/wordprocessingInk" xmlns:wne="http://schemas.microsoft.com/office/word/2006/wordml" xmlns:wps="http://schemas.microsoft.com/office/word/2010/wordprocessingShape" mc:Ignorable="w14 w15 w16se w16cid w16 w16cex w16sdtdh w16sdtfl w16du wp14">
   <w:p>
     <w:pPr>
       <w:pStyle w:val="Header"/>
@@ -1297,7 +1304,7 @@
 </file>
 
 <file path=word/header2.xml><?xml version="1.0" encoding="utf-8"?>
-<w:hdr xmlns:wpc="http://schemas.microsoft.com/office/word/2010/wordprocessingCanvas" xmlns:cx="http://schemas.microsoft.com/office/drawing/2014/chartex" xmlns:cx1="http://schemas.microsoft.com/office/drawing/2015/9/8/chartex" xmlns:cx2="http://schemas.microsoft.com/office/drawing/2015/10/21/chartex" xmlns:cx3="http://schemas.microsoft.com/office/drawing/2016/5/9/chartex" xmlns:cx4="http://schemas.microsoft.com/office/drawing/2016/5/10/chartex" xmlns:cx5="http://schemas.microsoft.com/office/drawing/2016/5/11/chartex" xmlns:cx6="http://schemas.microsoft.com/office/drawing/2016/5/12/chartex" xmlns:cx7="http://schemas.microsoft.com/office/drawing/2016/5/13/chartex" xmlns:cx8="http://schemas.microsoft.com/office/drawing/2016/5/14/chartex" xmlns:mc="http://schemas.openxmlformats.org/markup-compatibility/2006" xmlns:aink="http://schemas.microsoft.com/office/drawing/2016/ink" xmlns:am3d="http://schemas.microsoft.com/office/drawing/2017/model3d" xmlns:o="urn:schemas-microsoft-com:office:office" xmlns:oel="http://schemas.microsoft.com/office/2019/extlst" xmlns:r="http://schemas.openxmlformats.org/officeDocument/2006/relationships" xmlns:m="http://schemas.openxmlformats.org/officeDocument/2006/math" xmlns:v="urn:schemas-microsoft-com:vml" xmlns:wp14="http://schemas.microsoft.com/office/word/2010/wordprocessingDrawing" xmlns:wp="http://schemas.openxmlformats.org/drawingml/2006/wordprocessingDrawing" xmlns:w10="urn:schemas-microsoft-com:office:word" xmlns:w="http://schemas.openxmlformats.org/wordprocessingml/2006/main" xmlns:w14="http://schemas.microsoft.com/office/word/2010/wordml" xmlns:w15="http://schemas.microsoft.com/office/word/2012/wordml" xmlns:w16cex="http://schemas.microsoft.com/office/word/2018/wordml/cex" xmlns:w16cid="http://schemas.microsoft.com/office/word/2016/wordml/cid" xmlns:w16="http://schemas.microsoft.com/office/word/2018/wordml" xmlns:w16du="http://schemas.microsoft.com/office/word/2023/wordml/word16du" xmlns:w16sdtdh="http://schemas.microsoft.com/office/word/2020/wordml/sdtdatahash" xmlns:w16sdtfl="http://schemas.microsoft.com/office/word/2024/wordml/sdtformatlock" xmlns:w16se="http://schemas.microsoft.com/office/word/2015/wordml/symex" xmlns:wpg="http://schemas.microsoft.com/office/word/2010/wordprocessingGroup" xmlns:wpi="http://schemas.microsoft.com/office/word/2010/wordprocessingInk" xmlns:wne="http://schemas.microsoft.com/office/word/2006/wordml" xmlns:wps="http://schemas.microsoft.com/office/word/2010/wordprocessingShape" mc:Ignorable="w14 w15 w16se w16cid w16 w16cex w16sdtdh w16sdtfl w16du wp14">
+<w:hdr xmlns:wpc="http://schemas.microsoft.com/office/word/2010/wordprocessingCanvas" xmlns:cx="http://schemas.microsoft.com/office/drawing/2014/chartex" xmlns:cx1="http://schemas.microsoft.com/office/drawing/2015/9/8/chartex" xmlns:cx2="http://schemas.microsoft.com/office/drawing/2015/10/21/chartex" xmlns:cx3="http://schemas.microsoft.com/office/drawing/2016/5/9/chartex" xmlns:cx4="http://schemas.microsoft.com/office/drawing/2016/5/10/chartex" xmlns:cx5="http://schemas.microsoft.com/office/drawing/2016/5/11/chartex" xmlns:cx6="http://schemas.microsoft.com/office/drawing/2016/5/12/chartex" xmlns:cx7="http://schemas.microsoft.com/office/drawing/2016/5/13/chartex" xmlns:cx8="http://schemas.microsoft.com/office/drawing/2016/5/14/chartex" xmlns:mc="http://schemas.openxmlformats.org/markup-compatibility/2006" xmlns:aink="http://schemas.microsoft.com/office/drawing/2016/ink" xmlns:am3d="http://schemas.microsoft.com/office/drawing/2017/model3d" xmlns:o="urn:schemas-microsoft-com:office:office" xmlns:oel="http://schemas.microsoft.com/office/2019/extlst" xmlns:r="http://schemas.openxmlformats.org/officeDocument/2006/relationships" xmlns:m="http://schemas.openxmlformats.org/officeDocument/2006/math" xmlns:v="urn:schemas-microsoft-com:vml" xmlns:wp14="http://schemas.microsoft.com/office/word/2010/wordprocessingDrawing" xmlns:wp="http://schemas.openxmlformats.org/drawingml/2006/wordprocessingDrawing" xmlns:w10="urn:schemas-microsoft-com:office:word" xmlns:w="http://schemas.openxmlformats.org/wordprocessingml/2006/main" xmlns:w14="http://schemas.microsoft.com/office/word/2010/wordml" xmlns:w15="http://schemas.microsoft.com/office/word/2012/wordml" xmlns:w16cei="http://schemas.microsoft.com/office/word/2026/wordml/cei" xmlns:w16cex="http://schemas.microsoft.com/office/word/2018/wordml/cex" xmlns:w16cid="http://schemas.microsoft.com/office/word/2016/wordml/cid" xmlns:w16="http://schemas.microsoft.com/office/word/2018/wordml" xmlns:w16du="http://schemas.microsoft.com/office/word/2023/wordml/word16du" xmlns:w16sdtdh="http://schemas.microsoft.com/office/word/2020/wordml/sdtdatahash" xmlns:w16sdtfl="http://schemas.microsoft.com/office/word/2024/wordml/sdtformatlock" xmlns:w16se="http://schemas.microsoft.com/office/word/2015/wordml/symex" xmlns:wpg="http://schemas.microsoft.com/office/word/2010/wordprocessingGroup" xmlns:wpi="http://schemas.microsoft.com/office/word/2010/wordprocessingInk" xmlns:wne="http://schemas.microsoft.com/office/word/2006/wordml" xmlns:wps="http://schemas.microsoft.com/office/word/2010/wordprocessingShape" mc:Ignorable="w14 w15 w16se w16cid w16 w16cex w16sdtdh w16sdtfl w16du wp14">
   <w:p>
     <w:pPr>
       <w:pStyle w:val="Header"/>
@@ -1382,7 +1389,7 @@
 </file>
 
 <file path=word/header3.xml><?xml version="1.0" encoding="utf-8"?>
-<w:hdr xmlns:wpc="http://schemas.microsoft.com/office/word/2010/wordprocessingCanvas" xmlns:cx="http://schemas.microsoft.com/office/drawing/2014/chartex" xmlns:cx1="http://schemas.microsoft.com/office/drawing/2015/9/8/chartex" xmlns:cx2="http://schemas.microsoft.com/office/drawing/2015/10/21/chartex" xmlns:cx3="http://schemas.microsoft.com/office/drawing/2016/5/9/chartex" xmlns:cx4="http://schemas.microsoft.com/office/drawing/2016/5/10/chartex" xmlns:cx5="http://schemas.microsoft.com/office/drawing/2016/5/11/chartex" xmlns:cx6="http://schemas.microsoft.com/office/drawing/2016/5/12/chartex" xmlns:cx7="http://schemas.microsoft.com/office/drawing/2016/5/13/chartex" xmlns:cx8="http://schemas.microsoft.com/office/drawing/2016/5/14/chartex" xmlns:mc="http://schemas.openxmlformats.org/markup-compatibility/2006" xmlns:aink="http://schemas.microsoft.com/office/drawing/2016/ink" xmlns:am3d="http://schemas.microsoft.com/office/drawing/2017/model3d" xmlns:o="urn:schemas-microsoft-com:office:office" xmlns:oel="http://schemas.microsoft.com/office/2019/extlst" xmlns:r="http://schemas.openxmlformats.org/officeDocument/2006/relationships" xmlns:m="http://schemas.openxmlformats.org/officeDocument/2006/math" xmlns:v="urn:schemas-microsoft-com:vml" xmlns:wp14="http://schemas.microsoft.com/office/word/2010/wordprocessingDrawing" xmlns:wp="http://schemas.openxmlformats.org/drawingml/2006/wordprocessingDrawing" xmlns:w10="urn:schemas-microsoft-com:office:word" xmlns:w="http://schemas.openxmlformats.org/wordprocessingml/2006/main" xmlns:w14="http://schemas.microsoft.com/office/word/2010/wordml" xmlns:w15="http://schemas.microsoft.com/office/word/2012/wordml" xmlns:w16cex="http://schemas.microsoft.com/office/word/2018/wordml/cex" xmlns:w16cid="http://schemas.microsoft.com/office/word/2016/wordml/cid" xmlns:w16="http://schemas.microsoft.com/office/word/2018/wordml" xmlns:w16du="http://schemas.microsoft.com/office/word/2023/wordml/word16du" xmlns:w16sdtdh="http://schemas.microsoft.com/office/word/2020/wordml/sdtdatahash" xmlns:w16sdtfl="http://schemas.microsoft.com/office/word/2024/wordml/sdtformatlock" xmlns:w16se="http://schemas.microsoft.com/office/word/2015/wordml/symex" xmlns:wpg="http://schemas.microsoft.com/office/word/2010/wordprocessingGroup" xmlns:wpi="http://schemas.microsoft.com/office/word/2010/wordprocessingInk" xmlns:wne="http://schemas.microsoft.com/office/word/2006/wordml" xmlns:wps="http://schemas.microsoft.com/office/word/2010/wordprocessingShape" mc:Ignorable="w14 w15 w16se w16cid w16 w16cex w16sdtdh w16sdtfl w16du wp14">
+<w:hdr xmlns:wpc="http://schemas.microsoft.com/office/word/2010/wordprocessingCanvas" xmlns:cx="http://schemas.microsoft.com/office/drawing/2014/chartex" xmlns:cx1="http://schemas.microsoft.com/office/drawing/2015/9/8/chartex" xmlns:cx2="http://schemas.microsoft.com/office/drawing/2015/10/21/chartex" xmlns:cx3="http://schemas.microsoft.com/office/drawing/2016/5/9/chartex" xmlns:cx4="http://schemas.microsoft.com/office/drawing/2016/5/10/chartex" xmlns:cx5="http://schemas.microsoft.com/office/drawing/2016/5/11/chartex" xmlns:cx6="http://schemas.microsoft.com/office/drawing/2016/5/12/chartex" xmlns:cx7="http://schemas.microsoft.com/office/drawing/2016/5/13/chartex" xmlns:cx8="http://schemas.microsoft.com/office/drawing/2016/5/14/chartex" xmlns:mc="http://schemas.openxmlformats.org/markup-compatibility/2006" xmlns:aink="http://schemas.microsoft.com/office/drawing/2016/ink" xmlns:am3d="http://schemas.microsoft.com/office/drawing/2017/model3d" xmlns:o="urn:schemas-microsoft-com:office:office" xmlns:oel="http://schemas.microsoft.com/office/2019/extlst" xmlns:r="http://schemas.openxmlformats.org/officeDocument/2006/relationships" xmlns:m="http://schemas.openxmlformats.org/officeDocument/2006/math" xmlns:v="urn:schemas-microsoft-com:vml" xmlns:wp14="http://schemas.microsoft.com/office/word/2010/wordprocessingDrawing" xmlns:wp="http://schemas.openxmlformats.org/drawingml/2006/wordprocessingDrawing" xmlns:w10="urn:schemas-microsoft-com:office:word" xmlns:w="http://schemas.openxmlformats.org/wordprocessingml/2006/main" xmlns:w14="http://schemas.microsoft.com/office/word/2010/wordml" xmlns:w15="http://schemas.microsoft.com/office/word/2012/wordml" xmlns:w16cei="http://schemas.microsoft.com/office/word/2026/wordml/cei" xmlns:w16cex="http://schemas.microsoft.com/office/word/2018/wordml/cex" xmlns:w16cid="http://schemas.microsoft.com/office/word/2016/wordml/cid" xmlns:w16="http://schemas.microsoft.com/office/word/2018/wordml" xmlns:w16du="http://schemas.microsoft.com/office/word/2023/wordml/word16du" xmlns:w16sdtdh="http://schemas.microsoft.com/office/word/2020/wordml/sdtdatahash" xmlns:w16sdtfl="http://schemas.microsoft.com/office/word/2024/wordml/sdtformatlock" xmlns:w16se="http://schemas.microsoft.com/office/word/2015/wordml/symex" xmlns:wpg="http://schemas.microsoft.com/office/word/2010/wordprocessingGroup" xmlns:wpi="http://schemas.microsoft.com/office/word/2010/wordprocessingInk" xmlns:wne="http://schemas.microsoft.com/office/word/2006/wordml" xmlns:wps="http://schemas.microsoft.com/office/word/2010/wordprocessingShape" mc:Ignorable="w14 w15 w16se w16cid w16 w16cex w16sdtdh w16sdtfl w16du wp14">
   <w:p>
     <w:pPr>
       <w:pStyle w:val="Header"/>
@@ -1392,7 +1399,7 @@
 </file>
 
 <file path=word/numbering.xml><?xml version="1.0" encoding="utf-8"?>
-<w:numbering xmlns:wpc="http://schemas.microsoft.com/office/word/2010/wordprocessingCanvas" xmlns:cx="http://schemas.microsoft.com/office/drawing/2014/chartex" xmlns:cx1="http://schemas.microsoft.com/office/drawing/2015/9/8/chartex" xmlns:cx2="http://schemas.microsoft.com/office/drawing/2015/10/21/chartex" xmlns:cx3="http://schemas.microsoft.com/office/drawing/2016/5/9/chartex" xmlns:cx4="http://schemas.microsoft.com/office/drawing/2016/5/10/chartex" xmlns:cx5="http://schemas.microsoft.com/office/drawing/2016/5/11/chartex" xmlns:cx6="http://schemas.microsoft.com/office/drawing/2016/5/12/chartex" xmlns:cx7="http://schemas.microsoft.com/office/drawing/2016/5/13/chartex" xmlns:cx8="http://schemas.microsoft.com/office/drawing/2016/5/14/chartex" xmlns:mc="http://schemas.openxmlformats.org/markup-compatibility/2006" xmlns:aink="http://schemas.microsoft.com/office/drawing/2016/ink" xmlns:am3d="http://schemas.microsoft.com/office/drawing/2017/model3d" xmlns:o="urn:schemas-microsoft-com:office:office" xmlns:oel="http://schemas.microsoft.com/office/2019/extlst" xmlns:r="http://schemas.openxmlformats.org/officeDocument/2006/relationships" xmlns:m="http://schemas.openxmlformats.org/officeDocument/2006/math" xmlns:v="urn:schemas-microsoft-com:vml" xmlns:wp14="http://schemas.microsoft.com/office/word/2010/wordprocessingDrawing" xmlns:wp="http://schemas.openxmlformats.org/drawingml/2006/wordprocessingDrawing" xmlns:w10="urn:schemas-microsoft-com:office:word" xmlns:w="http://schemas.openxmlformats.org/wordprocessingml/2006/main" xmlns:w14="http://schemas.microsoft.com/office/word/2010/wordml" xmlns:w15="http://schemas.microsoft.com/office/word/2012/wordml" xmlns:w16cex="http://schemas.microsoft.com/office/word/2018/wordml/cex" xmlns:w16cid="http://schemas.microsoft.com/office/word/2016/wordml/cid" xmlns:w16="http://schemas.microsoft.com/office/word/2018/wordml" xmlns:w16du="http://schemas.microsoft.com/office/word/2023/wordml/word16du" xmlns:w16sdtdh="http://schemas.microsoft.com/office/word/2020/wordml/sdtdatahash" xmlns:w16sdtfl="http://schemas.microsoft.com/office/word/2024/wordml/sdtformatlock" xmlns:w16se="http://schemas.microsoft.com/office/word/2015/wordml/symex" xmlns:wpg="http://schemas.microsoft.com/office/word/2010/wordprocessingGroup" xmlns:wpi="http://schemas.microsoft.com/office/word/2010/wordprocessingInk" xmlns:wne="http://schemas.microsoft.com/office/word/2006/wordml" xmlns:wps="http://schemas.microsoft.com/office/word/2010/wordprocessingShape" mc:Ignorable="w14 w15 w16se w16cid w16 w16cex w16sdtdh w16sdtfl w16du wp14">
+<w:numbering xmlns:wpc="http://schemas.microsoft.com/office/word/2010/wordprocessingCanvas" xmlns:cx="http://schemas.microsoft.com/office/drawing/2014/chartex" xmlns:cx1="http://schemas.microsoft.com/office/drawing/2015/9/8/chartex" xmlns:cx2="http://schemas.microsoft.com/office/drawing/2015/10/21/chartex" xmlns:cx3="http://schemas.microsoft.com/office/drawing/2016/5/9/chartex" xmlns:cx4="http://schemas.microsoft.com/office/drawing/2016/5/10/chartex" xmlns:cx5="http://schemas.microsoft.com/office/drawing/2016/5/11/chartex" xmlns:cx6="http://schemas.microsoft.com/office/drawing/2016/5/12/chartex" xmlns:cx7="http://schemas.microsoft.com/office/drawing/2016/5/13/chartex" xmlns:cx8="http://schemas.microsoft.com/office/drawing/2016/5/14/chartex" xmlns:mc="http://schemas.openxmlformats.org/markup-compatibility/2006" xmlns:aink="http://schemas.microsoft.com/office/drawing/2016/ink" xmlns:am3d="http://schemas.microsoft.com/office/drawing/2017/model3d" xmlns:o="urn:schemas-microsoft-com:office:office" xmlns:oel="http://schemas.microsoft.com/office/2019/extlst" xmlns:r="http://schemas.openxmlformats.org/officeDocument/2006/relationships" xmlns:m="http://schemas.openxmlformats.org/officeDocument/2006/math" xmlns:v="urn:schemas-microsoft-com:vml" xmlns:wp14="http://schemas.microsoft.com/office/word/2010/wordprocessingDrawing" xmlns:wp="http://schemas.openxmlformats.org/drawingml/2006/wordprocessingDrawing" xmlns:w10="urn:schemas-microsoft-com:office:word" xmlns:w="http://schemas.openxmlformats.org/wordprocessingml/2006/main" xmlns:w14="http://schemas.microsoft.com/office/word/2010/wordml" xmlns:w15="http://schemas.microsoft.com/office/word/2012/wordml" xmlns:w16cei="http://schemas.microsoft.com/office/word/2026/wordml/cei" xmlns:w16cex="http://schemas.microsoft.com/office/word/2018/wordml/cex" xmlns:w16cid="http://schemas.microsoft.com/office/word/2016/wordml/cid" xmlns:w16="http://schemas.microsoft.com/office/word/2018/wordml" xmlns:w16du="http://schemas.microsoft.com/office/word/2023/wordml/word16du" xmlns:w16sdtdh="http://schemas.microsoft.com/office/word/2020/wordml/sdtdatahash" xmlns:w16sdtfl="http://schemas.microsoft.com/office/word/2024/wordml/sdtformatlock" xmlns:w16se="http://schemas.microsoft.com/office/word/2015/wordml/symex" xmlns:wpg="http://schemas.microsoft.com/office/word/2010/wordprocessingGroup" xmlns:wpi="http://schemas.microsoft.com/office/word/2010/wordprocessingInk" xmlns:wne="http://schemas.microsoft.com/office/word/2006/wordml" xmlns:wps="http://schemas.microsoft.com/office/word/2010/wordprocessingShape" mc:Ignorable="w14 w15 w16se w16cid w16 w16cex w16sdtdh w16sdtfl w16du wp14">
   <w:abstractNum w:abstractNumId="0" w15:restartNumberingAfterBreak="0">
     <w:nsid w:val="04806259"/>
     <w:multiLevelType w:val="hybridMultilevel"/>

</xml_diff>

<commit_message>
fix: unmerged EDUCATION & SKILLS table and reordered before CAREER HISTORY in Strata template
</commit_message>
<xml_diff>
--- a/Backend/templates/Strata - CVF Template.docx
+++ b/Backend/templates/Strata - CVF Template.docx
@@ -872,23 +872,13 @@
                 <w:b/>
                 <w:color w:val="FFFFFF"/>
               </w:rPr>
-              <w:t>CAREER HISTORY</w:t>
+              <w:t>EDUCATION &amp; SKILLS</w:t>
             </w:r>
           </w:p>
         </w:tc>
       </w:tr>
     </w:tbl>
-    <w:p>
-      <w:pPr>
-        <w:rPr>
-          <w:rFonts w:ascii="Calibri" w:hAnsi="Calibri" w:cs="Calibri"/>
-          <w:color w:val="000000"/>
-          <w:sz w:val="22"/>
-          <w:szCs w:val="22"/>
-          <w:lang w:val="en-GB"/>
-        </w:rPr>
-      </w:pPr>
-    </w:p>
+    <w:p/>
     <w:tbl>
       <w:tblPr>
         <w:tblW w:w="5000" w:type="pct"/>
@@ -919,7 +909,7 @@
                 <w:b/>
                 <w:color w:val="FFFFFF"/>
               </w:rPr>
-              <w:t>EDUCATION &amp; SKILLS</w:t>
+              <w:t>CAREER HISTORY</w:t>
             </w:r>
           </w:p>
         </w:tc>

</xml_diff>

<commit_message>
fix: move EDUCATION & SKILLS to the end of Strata template
</commit_message>
<xml_diff>
--- a/Backend/templates/Strata - CVF Template.docx
+++ b/Backend/templates/Strata - CVF Template.docx
@@ -872,7 +872,7 @@
                 <w:b/>
                 <w:color w:val="FFFFFF"/>
               </w:rPr>
-              <w:t>EDUCATION &amp; SKILLS</w:t>
+              <w:t>CAREER HISTORY</w:t>
             </w:r>
           </w:p>
         </w:tc>
@@ -909,7 +909,7 @@
                 <w:b/>
                 <w:color w:val="FFFFFF"/>
               </w:rPr>
-              <w:t>CAREER HISTORY</w:t>
+              <w:t>EDUCATION &amp; SKILLS</w:t>
             </w:r>
           </w:p>
         </w:tc>

</xml_diff>